<commit_message>
Resi dei clienti privati: un blocco unico nel manuale, e il retail non riceve piu' i termini B2B
Manuale: via le tre copie di MAIL 1/2/3 e l'email inglese con Spinea, Vipava e
14,90. Al loro posto il blocco "RESI E CAMBI — CLIENTI PRIVATI" con la
traduzione inglese; Vipava sta in "USO INTERNO — MAGAZZINO IN SLOVENIA";
i termini delle palestre, intatti, sono intestati "TERMINI B2B — PALESTRE E
RIVENDITORI".

Codice: rispondi_dal_manuale non consegna al profilo retail le sezioni che
cominciano con "TERMINI B2B" o "USO INTERNO", ne' le loro righe
nell'appendice. Staff e b2b invariati. /search-knowledge accetta
profilo=retail per vedere la consegna del cliente finale.

Co-Authored-By: Claude Opus 5.5 (1M context) <noreply@anthropic.com>
</commit_message>
<xml_diff>
--- a/manuale_operativo.docx
+++ b/manuale_operativo.docx
@@ -60,6 +60,11 @@
     </w:p>
     <w:p>
       <w:r>
+        <w:t>TERMINI B2B — PALESTRE E RIVENDITORI</w:t>
+      </w:r>
+    </w:p>
+    <w:p>
+      <w:r>
         <w:t>B2B Partnership Terms – Kano Kimonos</w:t>
       </w:r>
     </w:p>
@@ -528,6 +533,11 @@
     </w:p>
     <w:p>
       <w:r>
+        <w:t>TERMINI B2B — PALESTRE E RIVENDITORI</w:t>
+      </w:r>
+    </w:p>
+    <w:p>
+      <w:r>
         <w:t>Kano Kimonos – B2B Collaboration Terms</w:t>
       </w:r>
     </w:p>
@@ -1340,6 +1350,11 @@
       <w:r>
         <w:br/>
         <w:t>Mauro – Kano Kimonos</w:t>
+      </w:r>
+    </w:p>
+    <w:p>
+      <w:r>
+        <w:t>TERMINI B2B — PALESTRE E RIVENDITORI</w:t>
       </w:r>
     </w:p>
     <w:p>
@@ -1745,6 +1760,11 @@
     </w:p>
     <w:p>
       <w:r>
+        <w:t>TERMINI B2B — PALESTRE E RIVENDITORI</w:t>
+      </w:r>
+    </w:p>
+    <w:p>
+      <w:r>
         <w:t>Termini di Collaborazione B2B – Kano Kimonos</w:t>
       </w:r>
     </w:p>
@@ -2070,154 +2090,15 @@
     </w:p>
     <w:p>
       <w:r>
-        <w:t>Dear,</w:t>
-      </w:r>
-    </w:p>
-    <w:p>
-      <w:r>
-        <w:t>Thank you for contacting us regarding the return of your item. We are happy to assist you!</w:t>
-      </w:r>
-    </w:p>
-    <w:p>
-      <w:r>
-        <w:t>To proceed with the return, please follow these instructions carefully:</w:t>
-      </w:r>
-    </w:p>
-    <w:p>
-      <w:r>
-        <w:lastRenderedPageBreak/>
-        <w:t>Item Inspection:</w:t>
-      </w:r>
-    </w:p>
-    <w:p>
-      <w:r>
-        <w:t>Ensure the item is in perfect condition, unused, and the original tag is still inside its original packaging.</w:t>
-      </w:r>
-    </w:p>
-    <w:p>
-      <w:r>
-        <w:t>Shipping Address:</w:t>
-      </w:r>
-    </w:p>
-    <w:p>
-      <w:r>
-        <w:t>BJJ Store</w:t>
-        <w:br/>
-        <w:t>Via Cavalcanti 4</w:t>
-        <w:br/>
-        <w:t>30038 Spinea (VE)</w:t>
-        <w:br/>
-        <w:t>Italia</w:t>
-      </w:r>
-    </w:p>
-    <w:p>
-      <w:r>
+        <w:t>USO INTERNO — MAGAZZINO IN SLOVENIA (non per i clienti)</w:t>
+        <w:br/>
         <w:t>Street: Goriška cesta 5 i</w:t>
-      </w:r>
-    </w:p>
-    <w:p>
-      <w:r>
-        <w:t xml:space="preserve">Post Code: 5271 </w:t>
-      </w:r>
-    </w:p>
-    <w:p>
-      <w:r>
+        <w:br/>
+        <w:t>Post Code: 5271</w:t>
+        <w:br/>
         <w:t>City: Vipava</w:t>
-      </w:r>
-    </w:p>
-    <w:p>
-      <w:r>
-        <w:t>Country: SloveniaReturn Options:</w:t>
-      </w:r>
-    </w:p>
-    <w:p>
-      <w:r>
-        <w:t>Refund: You will receive a full refund for the amount paid (excluding shipping costs).</w:t>
-      </w:r>
-    </w:p>
-    <w:p>
-      <w:r>
-        <w:t>Exchange for Another Product: If you prefer a different product (size or model), you will be charged a fee of €14.90 for shipping the new item.</w:t>
-      </w:r>
-    </w:p>
-    <w:p>
-      <w:r>
-        <w:t>Return for Unordered or Incorrectly Sized Product: If you received an item you did not order or that is the wrong size, we will send a courier at our expense to collect the item and send you the correct size. The return slip is attached and should be printed and affixed to the package for courier pickup.</w:t>
-      </w:r>
-    </w:p>
-    <w:p>
-      <w:r>
-        <w:t>Packaging:</w:t>
-      </w:r>
-    </w:p>
-    <w:p>
-      <w:r>
-        <w:t>Carefully pack the item in its original packaging.</w:t>
-      </w:r>
-    </w:p>
-    <w:p>
-      <w:r>
-        <w:t>Include a copy of your receipt inside the package.</w:t>
-      </w:r>
-    </w:p>
-    <w:p>
-      <w:r>
-        <w:t>Shipping:</w:t>
-      </w:r>
-    </w:p>
-    <w:p>
-      <w:r>
-        <w:t>Ship the package at your own expense to the address indicated above.</w:t>
-      </w:r>
-    </w:p>
-    <w:p>
-      <w:r>
-        <w:t>Refund Times:</w:t>
-      </w:r>
-    </w:p>
-    <w:p>
-      <w:r>
-        <w:t>Refund: Your refund will be processed within 14 days of receiving the returned item.</w:t>
-      </w:r>
-    </w:p>
-    <w:p>
-      <w:r>
-        <w:t>Exchange for Another Product: The new item will be shipped within 24 hours of receiving the returned item.</w:t>
-      </w:r>
-    </w:p>
-    <w:p>
-      <w:r>
-        <w:t>Questions or Concerns:</w:t>
-      </w:r>
-    </w:p>
-    <w:p>
-      <w:r>
-        <w:t>If you have any questions or concerns, please do not hesitate to contact us. We are here to help!</w:t>
-      </w:r>
-    </w:p>
-    <w:p>
-      <w:r>
-        <w:t>Courier:</w:t>
-      </w:r>
-    </w:p>
-    <w:p>
-      <w:r>
-        <w:lastRenderedPageBreak/>
-        <w:t>If you have chosen the option to return the item via courier, please notify us when the package is ready for pickup.</w:t>
-      </w:r>
-    </w:p>
-    <w:p>
-      <w:r>
-        <w:t>Sincerely,</w:t>
-      </w:r>
-    </w:p>
-    <w:p>
-      <w:r>
-        <w:t xml:space="preserve">Kano Kimonos </w:t>
-      </w:r>
-      <w:r>
-        <w:br/>
-        <w:t>Mauro Danesin</w:t>
+        <w:br/>
+        <w:t>Country: Slovenia</w:t>
       </w:r>
     </w:p>
     <w:p>
@@ -2835,323 +2716,6 @@
     </w:p>
     <w:p>
       <w:r>
-        <w:t>Certo! Hai perfettamente ragione: meglio differenziare i messaggi in base alla richiesta per evitare di suggerire l'opzione del rimborso a chi vuole semplicemente fare un cambio.</w:t>
-      </w:r>
-    </w:p>
-    <w:p>
-      <w:r>
-        <w:t>Ecco le due versioni distinte:</w:t>
-      </w:r>
-    </w:p>
-    <w:p>
-      <w:r>
-        <w:t>✅ MAIL 1 – PER IL CAMBIO DI TAGLIA O MODELLO</w:t>
-      </w:r>
-    </w:p>
-    <w:p>
-      <w:r>
-        <w:t>Oggetto: Istruzioni per cambio prodotto</w:t>
-      </w:r>
-    </w:p>
-    <w:p>
-      <w:r>
-        <w:t>Ciao,</w:t>
-      </w:r>
-      <w:r>
-        <w:br/>
-        <w:t>Grazie per averci contattato! Siamo felici di assisterti per il cambio del prodotto.</w:t>
-      </w:r>
-    </w:p>
-    <w:p>
-      <w:r>
-        <w:t>Ti ricordiamo che la procedura di reso deve essere avviata entro 14 giorni dalla ricezione della merce.</w:t>
-      </w:r>
-    </w:p>
-    <w:p>
-      <w:r>
-        <w:t>Per procedere con il cambio di taglia o modello, ti chiediamo di seguire queste semplici istruzioni:</w:t>
-      </w:r>
-    </w:p>
-    <w:p>
-      <w:r>
-        <w:t>Verifica del capo:</w:t>
-      </w:r>
-      <w:r>
-        <w:br/>
-        <w:t>Assicurati che il capo sia integro, mai utilizzato, e con l’etichetta originale all’interno della sua busta.</w:t>
-      </w:r>
-    </w:p>
-    <w:p>
-      <w:r>
-        <w:t>Indirizzo di spedizione:</w:t>
-        <w:br/>
-        <w:t>BJJ Store</w:t>
-        <w:br/>
-        <w:t>Via Cavalcanti 4</w:t>
-        <w:br/>
-        <w:t>30038 Spinea (VE)</w:t>
-        <w:br/>
-        <w:t>Italia</w:t>
-      </w:r>
-    </w:p>
-    <w:p>
-      <w:r>
-        <w:t>Spedizione del reso:</w:t>
-      </w:r>
-      <w:r>
-        <w:br/>
-        <w:t>Spedisci il pacco a tuo carico all’indirizzo sopra indicato.</w:t>
-      </w:r>
-      <w:r>
-        <w:br/>
-        <w:t>Ti chiediamo di includere una copia della ricevuta d’acquisto all’interno del pacco.</w:t>
-      </w:r>
-    </w:p>
-    <w:p>
-      <w:r>
-        <w:t>Contributo per la nuova spedizione:</w:t>
-      </w:r>
-      <w:r>
-        <w:br/>
-        <w:t>Per ricevere il nuovo capo, è richiesto un contributo di €5,90 per la spedizione. Ti invieremo il link per il pagamento non appena riceveremo il pacco.</w:t>
-      </w:r>
-    </w:p>
-    <w:p>
-      <w:r>
-        <w:lastRenderedPageBreak/>
-        <w:t>Tempistiche:</w:t>
-      </w:r>
-      <w:r>
-        <w:br/>
-        <w:t>Il nuovo articolo verrà spedito entro 24 ore dalla ricezione del capo reso.</w:t>
-      </w:r>
-    </w:p>
-    <w:p>
-      <w:r>
-        <w:t>Per qualsiasi dubbio, siamo a tua completa disposizione.</w:t>
-      </w:r>
-      <w:r>
-        <w:br/>
-        <w:t>A presto!</w:t>
-      </w:r>
-      <w:r>
-        <w:br/>
-      </w:r>
-      <w:r>
-        <w:br/>
-        <w:t>Mauro</w:t>
-      </w:r>
-      <w:r>
-        <w:br/>
-        <w:t>Kano Kimonos</w:t>
-      </w:r>
-    </w:p>
-    <w:p>
-      <w:r>
-        <w:t>🔁 MAIL 2 – PER RICHIESTE DI RIMBORSO</w:t>
-      </w:r>
-    </w:p>
-    <w:p>
-      <w:r>
-        <w:t>Oggetto: Istruzioni per reso con rimborso</w:t>
-      </w:r>
-    </w:p>
-    <w:p>
-      <w:r>
-        <w:t>Ciao,</w:t>
-      </w:r>
-      <w:r>
-        <w:br/>
-        <w:t>Grazie per averci contattato. Di seguito ti forniamo tutte le informazioni necessarie per effettuare un reso con richiesta di rimborso.</w:t>
-      </w:r>
-    </w:p>
-    <w:p>
-      <w:r>
-        <w:t>⚠️ Attenzione: ti ricordiamo che la procedura deve essere avviata entro e non oltre 14 giorni dalla ricezione del prodotto.</w:t>
-      </w:r>
-      <w:r>
-        <w:br/>
-        <w:t>Richieste inoltrate dopo questo termine non potranno essere accettate.</w:t>
-      </w:r>
-    </w:p>
-    <w:p>
-      <w:r>
-        <w:t>Inoltre, ti segnaliamo che il rimborso comporta tempi più lunghi e una gestione amministrativa complessa. Per questo motivo, quando possibile, consigliamo sempre la soluzione del cambio taglia o modello, molto più rapida e conveniente per entrambe le parti.</w:t>
-      </w:r>
-    </w:p>
-    <w:p>
-      <w:r>
-        <w:t>Se desideri comunque procedere con il rimborso:</w:t>
-      </w:r>
-    </w:p>
-    <w:p>
-      <w:r>
-        <w:t>1. Verifica del capo:</w:t>
-      </w:r>
-      <w:r>
-        <w:br/>
-        <w:t>Il prodotto deve essere integro, mai utilizzato, con etichetta originale e confezione intatta.</w:t>
-      </w:r>
-      <w:r>
-        <w:br/>
-        <w:t>Capo lavato, usato, o con confezione mancante o danneggiata non potrà essere accettato per il rimborso.</w:t>
-      </w:r>
-    </w:p>
-    <w:p>
-      <w:r>
-        <w:t>2. Indirizzo di spedizione:</w:t>
-        <w:br/>
-        <w:t>BJJ Store</w:t>
-        <w:br/>
-        <w:t>Via Cavalcanti 4</w:t>
-        <w:br/>
-        <w:t>30038 Spinea (VE)</w:t>
-        <w:br/>
-        <w:t>Italia</w:t>
-      </w:r>
-    </w:p>
-    <w:p>
-      <w:r>
-        <w:t>3. Imballaggio:</w:t>
-      </w:r>
-      <w:r>
-        <w:br/>
-        <w:t>Assicurati di imballare il capo accuratamente nella sua confezione originale. Inserisci nel pacco anche una copia della ricevuta d’acquisto.</w:t>
-      </w:r>
-    </w:p>
-    <w:p>
-      <w:r>
-        <w:t>4. Spedizione:</w:t>
-      </w:r>
-      <w:r>
-        <w:br/>
-        <w:t>La spedizione è a carico del cliente e dovrà essere effettuata con un servizio tracciabile.</w:t>
-      </w:r>
-      <w:r>
-        <w:br/>
-        <w:t>In caso di smarrimento del pacco da parte del corriere, non potremo effettuare alcun rimborso.</w:t>
-      </w:r>
-    </w:p>
-    <w:p>
-      <w:r>
-        <w:lastRenderedPageBreak/>
-        <w:t>5. Tempistiche:</w:t>
-      </w:r>
-      <w:r>
-        <w:br/>
-        <w:t>Dopo aver ricevuto e verificato il prodotto, procederemo con il rimborso dell’importo pagato (escluse le spese di spedizione) entro 14 giorni dalla ricezione del pacco.</w:t>
-      </w:r>
-    </w:p>
-    <w:p>
-      <w:r>
-        <w:t>Siamo sempre a disposizione per trovare la soluzione più semplice e vantaggiosa per te.</w:t>
-      </w:r>
-      <w:r>
-        <w:br/>
-        <w:t>Contattaci se desideri invece effettuare un cambio taglia o modello, che garantisce tempistiche più brevi e costi ridotti.</w:t>
-      </w:r>
-    </w:p>
-    <w:p>
-      <w:r>
-        <w:t>Grazie per aver scelto Kano Kimonos!</w:t>
-      </w:r>
-    </w:p>
-    <w:p>
-      <w:r>
-        <w:t>🔁 MAIL 3 – ERRORE NEL PRODOTTO INVIATO</w:t>
-      </w:r>
-    </w:p>
-    <w:p>
-      <w:r>
-        <w:t>Oggetto: Istruzioni per reso e sostituzione per errore nella spedizione</w:t>
-      </w:r>
-    </w:p>
-    <w:p>
-      <w:r>
-        <w:t>Ciao,</w:t>
-      </w:r>
-      <w:r>
-        <w:br/>
-        <w:t>ci dispiace per l’errore nella spedizione e ci scusiamo per l’inconveniente.</w:t>
-      </w:r>
-      <w:r>
-        <w:br/>
-        <w:t>Provvederemo al più presto a risolvere il problema e inviarti il prodotto corretto.</w:t>
-      </w:r>
-    </w:p>
-    <w:p>
-      <w:r>
-        <w:t>Ecco le istruzioni da seguire:</w:t>
-      </w:r>
-    </w:p>
-    <w:p>
-      <w:r>
-        <w:t>1. Verifica del capo:</w:t>
-      </w:r>
-      <w:r>
-        <w:br/>
-        <w:t>Il prodotto che hai ricevuto deve essere restituito integro, mai utilizzato, con etichetta originale e confezione intatta.</w:t>
-      </w:r>
-      <w:r>
-        <w:br/>
-        <w:t>Capi usati, lavati o danneggiati non possono essere accettati per la sostituzione.</w:t>
-      </w:r>
-    </w:p>
-    <w:p>
-      <w:r>
-        <w:t>2. Reso a nostro carico – due opzioni disponibili:</w:t>
-      </w:r>
-      <w:r>
-        <w:br/>
-        <w:t>Puoi scegliere come restituire il capo:</w:t>
-      </w:r>
-    </w:p>
-    <w:p>
-      <w:r>
-        <w:t>🔹 Opzione A – Ritiro a domicilio:</w:t>
-      </w:r>
-      <w:r>
-        <w:br/>
-        <w:t>Ti invieremo una lettera di vettura prepagata e organizzeremo un ritiro a casa tua tramite corriere.</w:t>
-      </w:r>
-      <w:r>
-        <w:br/>
-        <w:t>Importante: è necessario garantire la presenza di qualcuno all’indirizzo indicato per il ritiro.</w:t>
-      </w:r>
-    </w:p>
-    <w:p>
-      <w:r>
-        <w:t>🔹 Opzione B – Consegna presso punto di raccolta:</w:t>
-      </w:r>
-      <w:r>
-        <w:br/>
-        <w:t>In alternativa, puoi consegnare il pacco in un punto di raccolta del corriere che ti indicheremo.</w:t>
-      </w:r>
-      <w:r>
-        <w:br/>
-        <w:t>Anche in questo caso ti invieremo la lettera di vettura prepagata da stampare e applicare al pacco.</w:t>
-      </w:r>
-    </w:p>
-    <w:p>
-      <w:r>
-        <w:t>3. Spedizione del nuovo prodotto:</w:t>
-      </w:r>
-      <w:r>
-        <w:br/>
-        <w:t>Una volta ricevuto e verificato il prodotto reso, procederemo entro 24 ore alla spedizione del capo corretto, sempre a nostro carico.</w:t>
-      </w:r>
-    </w:p>
-    <w:p>
-      <w:r>
-        <w:t>Per qualsiasi dubbio o per confermarci quale opzione di reso preferisci, siamo a completa disposizione.</w:t>
-      </w:r>
-      <w:r>
-        <w:br/>
-        <w:t>Grazie per la pazienza e per aver scelto Kano Kimonos!</w:t>
-      </w:r>
-    </w:p>
-    <w:p>
-      <w:r>
         <w:lastRenderedPageBreak/>
         <w:t>Ciao,</w:t>
       </w:r>
@@ -3791,6 +3355,11 @@
       <w:r>
         <w:br/>
         <w:t>Mauro – Kano Kimonos</w:t>
+      </w:r>
+    </w:p>
+    <w:p>
+      <w:r>
+        <w:t>TERMINI B2B — PALESTRE E RIVENDITORI</w:t>
       </w:r>
     </w:p>
     <w:p>
@@ -4329,316 +3898,44 @@
     </w:p>
     <w:p>
       <w:r>
-        <w:t>Richiesta informazioni per cambio prodotto / restituzione con rimborso</w:t>
-      </w:r>
-    </w:p>
-    <w:p>
-      <w:r>
-        <w:t>✅ MAIL 1 – PER IL CAMBIO DI TAGLIA O MODELLO</w:t>
-      </w:r>
-    </w:p>
-    <w:p>
-      <w:r>
-        <w:t>Oggetto: Istruzioni per cambio prodotto</w:t>
-      </w:r>
-    </w:p>
-    <w:p>
-      <w:r>
-        <w:t>Ciao,</w:t>
-      </w:r>
-      <w:r>
-        <w:br/>
-        <w:t>Grazie per averci contattato! Siamo felici di assisterti per il cambio del prodotto.</w:t>
-      </w:r>
-    </w:p>
-    <w:p>
-      <w:r>
-        <w:t>Ti ricordiamo che la procedura di reso deve essere avviata entro 14 giorni dalla ricezione della merce.</w:t>
-      </w:r>
-    </w:p>
-    <w:p>
-      <w:r>
-        <w:t>Per procedere con il cambio di taglia o modello, ti chiediamo di seguire queste semplici istruzioni:</w:t>
-      </w:r>
-    </w:p>
-    <w:p>
-      <w:r>
-        <w:t>Verifica del capo:</w:t>
-      </w:r>
-      <w:r>
-        <w:br/>
-        <w:t>Assicurati che il capo sia integro, mai utilizzato, e con l’etichetta originale all’interno della sua busta.</w:t>
-      </w:r>
-    </w:p>
-    <w:p>
-      <w:r>
-        <w:t>Indirizzo di spedizione:</w:t>
-        <w:br/>
-        <w:t>BJJ Store</w:t>
-        <w:br/>
-        <w:t>Via Cavalcanti 4</w:t>
-        <w:br/>
-        <w:t>30038 Spinea (VE)</w:t>
-        <w:br/>
-        <w:t>Italia</w:t>
-      </w:r>
-    </w:p>
-    <w:p>
-      <w:r>
-        <w:t>Spedizione del reso:</w:t>
-      </w:r>
-      <w:r>
-        <w:br/>
-        <w:t>Spedisci il pacco a tuo carico all’indirizzo sopra indicato.</w:t>
-      </w:r>
-      <w:r>
-        <w:br/>
-        <w:t>Ti chiediamo di includere una copia della ricevuta d’acquisto all’interno del pacco.</w:t>
-      </w:r>
-    </w:p>
-    <w:p>
-      <w:r>
-        <w:t>Contributo per la nuova spedizione:</w:t>
-      </w:r>
-      <w:r>
-        <w:br/>
-        <w:t>Per ricevere il nuovo capo, è richiesto un contributo di €5,90 per la spedizione. Ti invieremo il link per il pagamento non appena riceveremo il pacco.</w:t>
-      </w:r>
-    </w:p>
-    <w:p>
-      <w:r>
-        <w:t>Tempistiche:</w:t>
-      </w:r>
-      <w:r>
-        <w:br/>
-        <w:t>Il nuovo articolo verrà spedito entro 24 ore dalla ricezione del capo reso.</w:t>
-      </w:r>
-    </w:p>
-    <w:p>
-      <w:r>
-        <w:t>Per qualsiasi dubbio, siamo a tua completa disposizione.</w:t>
-      </w:r>
-      <w:r>
-        <w:br/>
-        <w:t>A presto!</w:t>
-      </w:r>
-      <w:r>
-        <w:br/>
-      </w:r>
-      <w:r>
-        <w:br/>
-        <w:t>Mauro</w:t>
-      </w:r>
-      <w:r>
-        <w:br/>
-        <w:t>Kano Kimonos</w:t>
-      </w:r>
-    </w:p>
-    <w:p>
-      <w:r>
-        <w:t>🔁 MAIL 2 – PER RICHIESTE DI RIMBORSO</w:t>
-      </w:r>
-    </w:p>
-    <w:p>
-      <w:r>
-        <w:t>Oggetto: Istruzioni per reso con rimborso</w:t>
-      </w:r>
-    </w:p>
-    <w:p>
-      <w:r>
-        <w:t>Ciao,</w:t>
-      </w:r>
-      <w:r>
-        <w:br/>
-        <w:t>Grazie per averci contattato. Di seguito ti forniamo tutte le informazioni necessarie per effettuare un reso con richiesta di rimborso.</w:t>
-      </w:r>
-    </w:p>
-    <w:p>
-      <w:r>
-        <w:t>⚠️ Attenzione: ti ricordiamo che la procedura deve essere avviata entro e non oltre 14 giorni dalla ricezione del prodotto.</w:t>
-      </w:r>
-      <w:r>
-        <w:br/>
-        <w:t>Richieste inoltrate dopo questo termine non potranno essere accettate.</w:t>
-      </w:r>
-    </w:p>
-    <w:p>
-      <w:r>
-        <w:t>Inoltre, ti segnaliamo che il rimborso comporta tempi più lunghi e una gestione amministrativa complessa. Per questo motivo, quando possibile, consigliamo sempre la soluzione del cambio taglia o modello, molto più rapida e conveniente per entrambe le parti.</w:t>
-      </w:r>
-    </w:p>
-    <w:p>
-      <w:r>
-        <w:t>Se desideri comunque procedere con il rimborso:</w:t>
-      </w:r>
-    </w:p>
-    <w:p>
-      <w:r>
-        <w:t>1. Verifica del capo:</w:t>
-      </w:r>
-      <w:r>
-        <w:br/>
-        <w:t>Il prodotto deve essere integro, mai utilizzato, con etichetta originale e confezione intatta.</w:t>
-      </w:r>
-      <w:r>
-        <w:br/>
-        <w:t>Capo lavato, usato, o con confezione mancante o danneggiata non potrà essere accettato per il rimborso.</w:t>
-      </w:r>
-    </w:p>
-    <w:p>
-      <w:r>
-        <w:t>2. Indirizzo di spedizione:</w:t>
-        <w:br/>
-        <w:t>BJJ Store</w:t>
-        <w:br/>
-        <w:t>Via Cavalcanti 4</w:t>
-        <w:br/>
-        <w:t>30038 Spinea (VE)</w:t>
-        <w:br/>
-        <w:t>Italia</w:t>
-      </w:r>
-    </w:p>
-    <w:p>
-      <w:r>
-        <w:t>3. Imballaggio:</w:t>
-      </w:r>
-      <w:r>
-        <w:br/>
-        <w:t>Assicurati di imballare il capo accuratamente nella sua confezione originale. Inserisci nel pacco anche una copia della ricevuta d’acquisto.</w:t>
-      </w:r>
-    </w:p>
-    <w:p>
-      <w:r>
-        <w:t>4. Spedizione:</w:t>
-      </w:r>
-      <w:r>
-        <w:br/>
-        <w:t>La spedizione è a carico del cliente e dovrà essere effettuata con un servizio tracciabile.</w:t>
-      </w:r>
-      <w:r>
-        <w:br/>
-        <w:t>In caso di smarrimento del pacco da parte del corriere, non potremo effettuare alcun rimborso.</w:t>
-      </w:r>
-    </w:p>
-    <w:p>
-      <w:r>
-        <w:t>5. Tempistiche:</w:t>
-      </w:r>
-      <w:r>
-        <w:br/>
-        <w:t>Dopo aver ricevuto e verificato il prodotto, procederemo con il rimborso dell’importo pagato (escluse le spese di spedizione) entro 14 giorni dalla ricezione del pacco.</w:t>
-      </w:r>
-    </w:p>
-    <w:p>
-      <w:r>
-        <w:t>Siamo sempre a disposizione per trovare la soluzione più semplice e vantaggiosa per te.</w:t>
-      </w:r>
-      <w:r>
-        <w:br/>
-        <w:t>Contattaci se desideri invece effettuare un cambio taglia o modello, che garantisce tempistiche più brevi e costi ridotti.</w:t>
-      </w:r>
-    </w:p>
-    <w:p>
-      <w:r>
-        <w:t>Grazie per aver scelto Kano Kimonos!</w:t>
-      </w:r>
-    </w:p>
-    <w:p>
-      <w:r>
-        <w:t>🔁 MAIL 3 – ERRORE NEL PRODOTTO INVIATO</w:t>
-      </w:r>
-    </w:p>
-    <w:p>
-      <w:r>
-        <w:t>Oggetto: Istruzioni per reso e sostituzione per errore nella spedizione</w:t>
-      </w:r>
-    </w:p>
-    <w:p>
-      <w:r>
-        <w:t>Ciao,</w:t>
-      </w:r>
-      <w:r>
-        <w:br/>
-        <w:t>ci dispiace per l’errore nella spedizione e ci scusiamo per l’inconveniente.</w:t>
-      </w:r>
-      <w:r>
-        <w:br/>
-        <w:t>Provvederemo al più presto a risolvere il problema e inviarti il prodotto corretto.</w:t>
-      </w:r>
-    </w:p>
-    <w:p>
-      <w:r>
-        <w:t>Ecco le istruzioni da seguire:</w:t>
-      </w:r>
-    </w:p>
-    <w:p>
-      <w:r>
-        <w:t>1. Verifica del capo:</w:t>
-      </w:r>
-      <w:r>
-        <w:br/>
-        <w:t>Il prodotto che hai ricevuto deve essere restituito integro, mai utilizzato, con etichetta originale e confezione intatta.</w:t>
-      </w:r>
-      <w:r>
-        <w:br/>
-        <w:t>Capi usati, lavati o danneggiati non possono essere accettati per la sostituzione.</w:t>
-      </w:r>
-    </w:p>
-    <w:p>
-      <w:r>
-        <w:t>2. Reso a nostro carico – due opzioni disponibili:</w:t>
-      </w:r>
-      <w:r>
-        <w:br/>
-        <w:t>Puoi scegliere come restituire il capo:</w:t>
-      </w:r>
-    </w:p>
-    <w:p>
-      <w:r>
-        <w:t>🔹 Opzione A – Ritiro a domicilio:</w:t>
-      </w:r>
-      <w:r>
-        <w:br/>
-        <w:t>Ti invieremo una lettera di vettura prepagata e organizzeremo un ritiro a casa tua tramite corriere.</w:t>
-      </w:r>
-      <w:r>
-        <w:br/>
-        <w:t>Importante: è necessario garantire la presenza di qualcuno all’indirizzo indicato per il ritiro.</w:t>
-      </w:r>
-    </w:p>
-    <w:p>
-      <w:r>
-        <w:t>🔹 Opzione B – Consegna presso punto di raccolta:</w:t>
-      </w:r>
-      <w:r>
-        <w:br/>
-        <w:t xml:space="preserve">In alternativa, puoi consegnare il pacco in un punto di raccolta del corriere che ti </w:t>
-      </w:r>
-      <w:r>
-        <w:lastRenderedPageBreak/>
-        <w:t>indicheremo.</w:t>
-      </w:r>
-      <w:r>
-        <w:br/>
-        <w:t>Anche in questo caso ti invieremo la lettera di vettura prepagata da stampare e applicare al pacco.</w:t>
-      </w:r>
-    </w:p>
-    <w:p>
-      <w:r>
-        <w:t>3. Spedizione del nuovo prodotto:</w:t>
-      </w:r>
-      <w:r>
-        <w:br/>
-        <w:t>Una volta ricevuto e verificato il prodotto reso, procederemo entro 24 ore alla spedizione del capo corretto, sempre a nostro carico.</w:t>
-      </w:r>
-    </w:p>
-    <w:p>
-      <w:r>
-        <w:t>Per qualsiasi dubbio o per confermarci quale opzione di reso preferisci, siamo a completa disposizione.</w:t>
-      </w:r>
-      <w:r>
-        <w:br/>
-        <w:t>Grazie per la pazienza e per aver scelto Kano Kimonos!</w:t>
+        <w:t>RESI E CAMBI — CLIENTI PRIVATI</w:t>
+        <w:br/>
+        <w:t>Questa sezione vale per resi, restituzioni, cambi, rimborsi e capi difettosi, sbagliati o danneggiati.</w:t>
+        <w:br/>
+        <w:t>1. Termine: 14 giorni dalla ricezione per aprire la richiesta scrivendo a info@kanokimonos.com. Passati i 14 giorni non si accettano cambi, resi né rimborsi.</w:t>
+        <w:br/>
+        <w:t>2. Condizioni del capo: perfetto, mai indossato, con tutte le etichette, rimesso correttamente nella sua busta.</w:t>
+        <w:br/>
+        <w:t>3. Indirizzo unico per tutti i resi: BJJ Store di Mauro Danesin, Via Cavalcanti 4, 30038 Spinea (VE), Italia.</w:t>
+        <w:br/>
+        <w:t>4. Cambio taglia o modello. Il cliente spedisce il capo a noi a proprie spese e sotto la propria responsabilità: se il pacco si perde durante quel viaggio, la perdita è a carico del cliente. Quando il pacco arriva e il capo risulta conforme, spediamo il capo nuovo entro 24 ore. La spedizione del capo nuovo è a carico del cliente, alla tariffa di spedizione standard del suo paese, anche se sull'ordine originale la spedizione era gratuita per aver superato la soglia. Questa spedizione viaggia con tracking ed è sotto la nostra responsabilità: se si perde, la rispediamo noi.</w:t>
+        <w:br/>
+        <w:t>5. Reso con rimborso. Il cliente rispedisce il capo a proprie spese e sotto la propria responsabilità. Ricevuto il capo e verificata la conformità, procediamo con il rimborso entro 14 giorni.</w:t>
+        <w:br/>
+        <w:t>6. Capo sbagliato o danneggiato. Il cliente scrive a info@kanokimonos.com con il numero d'ordine, le foto e la spiegazione di cosa è successo. Il cambio è interamente a carico nostro, sia il ritiro sia la spedizione del capo corretto.</w:t>
+        <w:br/>
+        <w:t>7. Capo tornato usato o rovinato: nessun costo automatico; il caso lo valuta una persona e il cliente viene ricontattato.</w:t>
+      </w:r>
+    </w:p>
+    <w:p>
+      <w:r>
+        <w:t>RETURNS AND EXCHANGES — PRIVATE CUSTOMERS</w:t>
+        <w:br/>
+        <w:t>This section covers returns, exchanges, refunds and defective, wrong or damaged items.</w:t>
+        <w:br/>
+        <w:t>1. Deadline: 14 days from receipt to open the request by writing to info@kanokimonos.com. After the 14 days, no exchanges, returns or refunds are accepted.</w:t>
+        <w:br/>
+        <w:t>2. Condition of the item: perfect, never worn, with all its tags, put back properly in its bag.</w:t>
+        <w:br/>
+        <w:t>3. Single address for all returns: BJJ Store di Mauro Danesin, Via Cavalcanti 4, 30038 Spinea (VE), Italy.</w:t>
+        <w:br/>
+        <w:t>4. Size or model exchange. The customer ships the item to us at their own expense and under their own responsibility: if the parcel is lost during that journey, the loss is borne by the customer. When the parcel arrives and the item is found to be compliant, we ship the new item within 24 hours. The shipping of the new item is paid by the customer, at the standard shipping rate of their country, even if shipping on the original order was free because it exceeded the threshold. This shipment travels with tracking and is under our responsibility: if it is lost, we ship it again.</w:t>
+        <w:br/>
+        <w:t>5. Return with refund. The customer sends the item back at their own expense and under their own responsibility. Once the item has been received and found to be compliant, we issue the refund within 14 days.</w:t>
+        <w:br/>
+        <w:t>6. Wrong or damaged item. The customer writes to info@kanokimonos.com with the order number, the photos and an explanation of what happened. The exchange is entirely at our expense, both the pickup and the shipping of the correct item.</w:t>
+        <w:br/>
+        <w:t>7. Item returned used or ruined: no automatic charge; the case is assessed by a person and the customer is contacted again.</w:t>
       </w:r>
     </w:p>
     <w:p>
@@ -4989,6 +4286,11 @@
     <w:p>
       <w:r>
         <w:t>-------------------------------------------------------------------------------</w:t>
+      </w:r>
+    </w:p>
+    <w:p>
+      <w:r>
+        <w:t>TERMINI B2B — PALESTRE E RIVENDITORI</w:t>
       </w:r>
     </w:p>
     <w:p>
@@ -6140,318 +5442,6 @@
     </w:p>
     <w:p>
       <w:r>
-        <w:t>Richiesta informazioni per cambio prodotto / restituzione con rimborso</w:t>
-      </w:r>
-    </w:p>
-    <w:p>
-      <w:r>
-        <w:t>✅ MAIL 1 – PER IL CAMBIO DI TAGLIA O MODELLO</w:t>
-      </w:r>
-    </w:p>
-    <w:p>
-      <w:r>
-        <w:t>Oggetto: Istruzioni per cambio prodotto</w:t>
-      </w:r>
-    </w:p>
-    <w:p>
-      <w:r>
-        <w:t>Ciao,</w:t>
-      </w:r>
-      <w:r>
-        <w:br/>
-        <w:t>Grazie per averci contattato! Siamo felici di assisterti per il cambio del prodotto.</w:t>
-      </w:r>
-    </w:p>
-    <w:p>
-      <w:r>
-        <w:t>Ti ricordiamo che la procedura di reso deve essere avviata entro 14 giorni dalla ricezione della merce.</w:t>
-      </w:r>
-    </w:p>
-    <w:p>
-      <w:r>
-        <w:t>Per procedere con il cambio di taglia o modello, ti chiediamo di seguire queste semplici istruzioni:</w:t>
-      </w:r>
-    </w:p>
-    <w:p>
-      <w:r>
-        <w:t>Verifica del capo:</w:t>
-      </w:r>
-      <w:r>
-        <w:br/>
-        <w:t>Assicurati che il capo sia integro, mai utilizzato, e con l’etichetta originale all’interno della sua busta.</w:t>
-      </w:r>
-    </w:p>
-    <w:p>
-      <w:r>
-        <w:t>Indirizzo di spedizione:</w:t>
-        <w:br/>
-        <w:t>BJJ Store</w:t>
-        <w:br/>
-        <w:t>Via Cavalcanti 4</w:t>
-        <w:br/>
-        <w:t>30038 Spinea (VE)</w:t>
-        <w:br/>
-        <w:t>Italia</w:t>
-      </w:r>
-    </w:p>
-    <w:p>
-      <w:r>
-        <w:t>Spedizione del reso:</w:t>
-      </w:r>
-      <w:r>
-        <w:br/>
-        <w:t>Spedisci il pacco a tuo carico all’indirizzo sopra indicato.</w:t>
-      </w:r>
-      <w:r>
-        <w:br/>
-        <w:t>Ti chiediamo di includere una copia della ricevuta d’acquisto all’interno del pacco.</w:t>
-      </w:r>
-    </w:p>
-    <w:p>
-      <w:r>
-        <w:t>Contributo per la nuova spedizione:</w:t>
-      </w:r>
-      <w:r>
-        <w:br/>
-        <w:t>Per ricevere il nuovo capo, è richiesto un contributo di €5,90 per la spedizione. Ti invieremo il link per il pagamento non appena riceveremo il pacco.</w:t>
-      </w:r>
-    </w:p>
-    <w:p>
-      <w:r>
-        <w:t>Tempistiche:</w:t>
-      </w:r>
-      <w:r>
-        <w:br/>
-        <w:t>Il nuovo articolo verrà spedito entro 24 ore dalla ricezione del capo reso.</w:t>
-      </w:r>
-    </w:p>
-    <w:p>
-      <w:r>
-        <w:t>Per qualsiasi dubbio, siamo a tua completa disposizione.</w:t>
-      </w:r>
-      <w:r>
-        <w:br/>
-        <w:t>A presto!</w:t>
-      </w:r>
-      <w:r>
-        <w:br/>
-      </w:r>
-      <w:r>
-        <w:br/>
-        <w:t>Mauro</w:t>
-      </w:r>
-      <w:r>
-        <w:br/>
-        <w:t>Kano Kimonos</w:t>
-      </w:r>
-    </w:p>
-    <w:p>
-      <w:r>
-        <w:t>🔁 MAIL 2 – PER RICHIESTE DI RIMBORSO</w:t>
-      </w:r>
-    </w:p>
-    <w:p>
-      <w:r>
-        <w:t>Oggetto: Istruzioni per reso con rimborso</w:t>
-      </w:r>
-    </w:p>
-    <w:p>
-      <w:r>
-        <w:lastRenderedPageBreak/>
-        <w:t>Ciao,</w:t>
-      </w:r>
-      <w:r>
-        <w:br/>
-        <w:t>Grazie per averci contattato. Di seguito ti forniamo tutte le informazioni necessarie per effettuare un reso con richiesta di rimborso.</w:t>
-      </w:r>
-    </w:p>
-    <w:p>
-      <w:r>
-        <w:t>⚠️ Attenzione: ti ricordiamo che la procedura deve essere avviata entro e non oltre 14 giorni dalla ricezione del prodotto.</w:t>
-      </w:r>
-      <w:r>
-        <w:br/>
-        <w:t>Richieste inoltrate dopo questo termine non potranno essere accettate.</w:t>
-      </w:r>
-    </w:p>
-    <w:p>
-      <w:r>
-        <w:t>Inoltre, ti segnaliamo che il rimborso comporta tempi più lunghi e una gestione amministrativa complessa. Per questo motivo, quando possibile, consigliamo sempre la soluzione del cambio taglia o modello, molto più rapida e conveniente per entrambe le parti.</w:t>
-      </w:r>
-    </w:p>
-    <w:p>
-      <w:r>
-        <w:t>Se desideri comunque procedere con il rimborso:</w:t>
-      </w:r>
-    </w:p>
-    <w:p>
-      <w:r>
-        <w:t>1. Verifica del capo:</w:t>
-      </w:r>
-      <w:r>
-        <w:br/>
-        <w:t>Il prodotto deve essere integro, mai utilizzato, con etichetta originale e confezione intatta.</w:t>
-      </w:r>
-      <w:r>
-        <w:br/>
-        <w:t>Capo lavato, usato, o con confezione mancante o danneggiata non potrà essere accettato per il rimborso.</w:t>
-      </w:r>
-    </w:p>
-    <w:p>
-      <w:r>
-        <w:t>2. Indirizzo di spedizione:</w:t>
-        <w:br/>
-        <w:t>BJJ Store</w:t>
-        <w:br/>
-        <w:t>Via Cavalcanti 4</w:t>
-        <w:br/>
-        <w:t>30038 Spinea (VE)</w:t>
-        <w:br/>
-        <w:t>Italia</w:t>
-      </w:r>
-    </w:p>
-    <w:p>
-      <w:r>
-        <w:t>3. Imballaggio:</w:t>
-      </w:r>
-      <w:r>
-        <w:br/>
-        <w:t>Assicurati di imballare il capo accuratamente nella sua confezione originale. Inserisci nel pacco anche una copia della ricevuta d’acquisto.</w:t>
-      </w:r>
-    </w:p>
-    <w:p>
-      <w:r>
-        <w:t>4. Spedizione:</w:t>
-      </w:r>
-      <w:r>
-        <w:br/>
-        <w:t>La spedizione è a carico del cliente e dovrà essere effettuata con un servizio tracciabile.</w:t>
-      </w:r>
-      <w:r>
-        <w:br/>
-        <w:t>In caso di smarrimento del pacco da parte del corriere, non potremo effettuare alcun rimborso.</w:t>
-      </w:r>
-    </w:p>
-    <w:p>
-      <w:r>
-        <w:t>5. Tempistiche:</w:t>
-      </w:r>
-      <w:r>
-        <w:br/>
-        <w:t>Dopo aver ricevuto e verificato il prodotto, procederemo con il rimborso dell’importo pagato (escluse le spese di spedizione) entro 14 giorni dalla ricezione del pacco.</w:t>
-      </w:r>
-    </w:p>
-    <w:p>
-      <w:r>
-        <w:t>Siamo sempre a disposizione per trovare la soluzione più semplice e vantaggiosa per te.</w:t>
-      </w:r>
-      <w:r>
-        <w:br/>
-        <w:t>Contattaci se desideri invece effettuare un cambio taglia o modello, che garantisce tempistiche più brevi e costi ridotti.</w:t>
-      </w:r>
-    </w:p>
-    <w:p>
-      <w:r>
-        <w:t>Grazie per aver scelto Kano Kimonos!</w:t>
-      </w:r>
-    </w:p>
-    <w:p>
-      <w:r>
-        <w:t>🔁 MAIL 3 – ERRORE NEL PRODOTTO INVIATO</w:t>
-      </w:r>
-    </w:p>
-    <w:p>
-      <w:r>
-        <w:t>Oggetto: Istruzioni per reso e sostituzione per errore nella spedizione</w:t>
-      </w:r>
-    </w:p>
-    <w:p>
-      <w:r>
-        <w:lastRenderedPageBreak/>
-        <w:t>Ciao,</w:t>
-      </w:r>
-      <w:r>
-        <w:br/>
-        <w:t>ci dispiace per l’errore nella spedizione e ci scusiamo per l’inconveniente.</w:t>
-      </w:r>
-      <w:r>
-        <w:br/>
-        <w:t>Provvederemo al più presto a risolvere il problema e inviarti il prodotto corretto.</w:t>
-      </w:r>
-    </w:p>
-    <w:p>
-      <w:r>
-        <w:t>Ecco le istruzioni da seguire:</w:t>
-      </w:r>
-    </w:p>
-    <w:p>
-      <w:r>
-        <w:t>1. Verifica del capo:</w:t>
-      </w:r>
-      <w:r>
-        <w:br/>
-        <w:t>Il prodotto che hai ricevuto deve essere restituito integro, mai utilizzato, con etichetta originale e confezione intatta.</w:t>
-      </w:r>
-      <w:r>
-        <w:br/>
-        <w:t>Capi usati, lavati o danneggiati non possono essere accettati per la sostituzione.</w:t>
-      </w:r>
-    </w:p>
-    <w:p>
-      <w:r>
-        <w:t>2. Reso a nostro carico – due opzioni disponibili:</w:t>
-      </w:r>
-      <w:r>
-        <w:br/>
-        <w:t>Puoi scegliere come restituire il capo:</w:t>
-      </w:r>
-    </w:p>
-    <w:p>
-      <w:r>
-        <w:t>🔹 Opzione A – Ritiro a domicilio:</w:t>
-      </w:r>
-      <w:r>
-        <w:br/>
-        <w:t>Ti invieremo una lettera di vettura prepagata e organizzeremo un ritiro a casa tua tramite corriere.</w:t>
-      </w:r>
-      <w:r>
-        <w:br/>
-        <w:t>Importante: è necessario garantire la presenza di qualcuno all’indirizzo indicato per il ritiro.</w:t>
-      </w:r>
-    </w:p>
-    <w:p>
-      <w:r>
-        <w:t>🔹 Opzione B – Consegna presso punto di raccolta:</w:t>
-      </w:r>
-      <w:r>
-        <w:br/>
-        <w:t>In alternativa, puoi consegnare il pacco in un punto di raccolta del corriere che ti indicheremo.</w:t>
-      </w:r>
-      <w:r>
-        <w:br/>
-        <w:t>Anche in questo caso ti invieremo la lettera di vettura prepagata da stampare e applicare al pacco.</w:t>
-      </w:r>
-    </w:p>
-    <w:p>
-      <w:r>
-        <w:t>3. Spedizione del nuovo prodotto:</w:t>
-      </w:r>
-      <w:r>
-        <w:br/>
-        <w:t>Una volta ricevuto e verificato il prodotto reso, procederemo entro 24 ore alla spedizione del capo corretto, sempre a nostro carico.</w:t>
-      </w:r>
-    </w:p>
-    <w:p>
-      <w:r>
-        <w:t>Per qualsiasi dubbio o per confermarci quale opzione di reso preferisci, siamo a completa disposizione.</w:t>
-      </w:r>
-      <w:r>
-        <w:br/>
-        <w:t>Grazie per la pazienza e per aver scelto Kano Kimonos!</w:t>
-      </w:r>
-    </w:p>
-    <w:p>
-      <w:r>
         <w:t>-------------------------------------------------------------------------------</w:t>
       </w:r>
     </w:p>
@@ -6790,6 +5780,11 @@
     <w:p>
       <w:r>
         <w:t>-------------------------------------------------------------------------------</w:t>
+      </w:r>
+    </w:p>
+    <w:p>
+      <w:r>
+        <w:t>TERMINI B2B — PALESTRE E RIVENDITORI</w:t>
       </w:r>
     </w:p>
     <w:p>

</xml_diff>

<commit_message>
Resi retail: indirizzo senza nome di persona, chi paga solo per capo sbagliato o danneggiato, prima il manuale
Manuale: "BJJ Store di Mauro Danesin" diventa "BJJ Store" (IT ed EN), cosi'
la redazione dei nomi non produce piu' "BJJ Store del nostro team".
RETAIL_PROMPT: nei reclami, capo arrivato sbagliato o danneggiato = ritiro e
rispedizione a carico nostro (unico caso); in ogni altro caso nessuna
promessa. Niente sintesi inventate prima delle regole del manuale. Su resi,
cambi, rimborsi e difetti si consulta il manuale prima di chiedere qualsiasi
cosa, e non si chiedono paese o stato dell'ordine.

Co-Authored-By: Claude Opus 5.5 (1M context) <noreply@anthropic.com>
</commit_message>
<xml_diff>
--- a/manuale_operativo.docx
+++ b/manuale_operativo.docx
@@ -3906,7 +3906,7 @@
         <w:br/>
         <w:t>2. Condizioni del capo: perfetto, mai indossato, con tutte le etichette, rimesso correttamente nella sua busta.</w:t>
         <w:br/>
-        <w:t>3. Indirizzo unico per tutti i resi: BJJ Store di Mauro Danesin, Via Cavalcanti 4, 30038 Spinea (VE), Italia.</w:t>
+        <w:t>3. Indirizzo unico per tutti i resi: BJJ Store, Via Cavalcanti 4, 30038 Spinea (VE), Italia.</w:t>
         <w:br/>
         <w:t>4. Cambio taglia o modello. Il cliente spedisce il capo a noi a proprie spese e sotto la propria responsabilità: se il pacco si perde durante quel viaggio, la perdita è a carico del cliente. Quando il pacco arriva e il capo risulta conforme, spediamo il capo nuovo entro 24 ore. La spedizione del capo nuovo è a carico del cliente, alla tariffa di spedizione standard del suo paese, anche se sull'ordine originale la spedizione era gratuita per aver superato la soglia. Questa spedizione viaggia con tracking ed è sotto la nostra responsabilità: se si perde, la rispediamo noi.</w:t>
         <w:br/>
@@ -3927,7 +3927,7 @@
         <w:br/>
         <w:t>2. Condition of the item: perfect, never worn, with all its tags, put back properly in its bag.</w:t>
         <w:br/>
-        <w:t>3. Single address for all returns: BJJ Store di Mauro Danesin, Via Cavalcanti 4, 30038 Spinea (VE), Italy.</w:t>
+        <w:t>3. Single address for all returns: BJJ Store, Via Cavalcanti 4, 30038 Spinea (VE), Italy.</w:t>
         <w:br/>
         <w:t>4. Size or model exchange. The customer ships the item to us at their own expense and under their own responsibility: if the parcel is lost during that journey, the loss is borne by the customer. When the parcel arrives and the item is found to be compliant, we ship the new item within 24 hours. The shipping of the new item is paid by the customer, at the standard shipping rate of their country, even if shipping on the original order was free because it exceeded the threshold. This shipment travels with tracking and is under our responsibility: if it is lost, we ship it again.</w:t>
         <w:br/>

</xml_diff>

<commit_message>
Manuale: IMMAGINI E LOGHI solo con la frase IT + EN; riga d'uso e 'chi decide' in USO INTERNO — IMMAGINI E LOGHI: CHI DECIDE
Co-Authored-By: Claude Opus 5.5 (1M context) <noreply@anthropic.com>
</commit_message>
<xml_diff>
--- a/manuale_operativo.docx
+++ b/manuale_operativo.docx
@@ -7172,12 +7172,21 @@
         <w:t>IMMAGINI E LOGHI: FORMATO E COSTO DI CONVERSIONE</w:t>
         <w:br/>
         <w:br/>
+        <w:t>"Le immagini vanno inviate in formato vettoriale (.AI, .EPS, .PDF, .SVG). Se hai solo un file raster (JPEG, PNG) lo accettiamo lo stesso: la conversione la facciamo noi e il costo e' di 25 euro a immagine. Se l'immagine e' semplice e lineare il nostro software riesce spesso a elaborarla senza costi aggiuntivi, e se le immagini sono piu' di una valutiamo un forfait in base al progetto: in entrambi i casi te lo confermiamo noi dopo aver visto i file, prima di procedere."</w:t>
+        <w:br/>
+        <w:t>"Artwork should be sent in vector format (.AI, .EPS, .PDF, .SVG). If you only have a raster file (JPEG, PNG) we still accept it: we take care of the conversion, at a cost of 25 euro per image. If the image is simple and clean our software can often process it at no extra cost, and if there is more than one image we may consider a flat rate depending on the project: in both cases we confirm this to you after seeing the files, before going ahead."</w:t>
+      </w:r>
+    </w:p>
+    <w:p/>
+    <w:p>
+      <w:r>
+        <w:t>USO INTERNO — IMMAGINI E LOGHI: CHI DECIDE</w:t>
+        <w:br/>
+        <w:br/>
         <w:t>Questa e' l'unica risposta sul formato delle immagini e sul costo della conversione, e vale per tutti allo stesso modo: staff, clienti business, clienti privati. Si riporta integra e alla lettera ogni volta che qualcuno chiede come inviare le immagini, in che formato, o cosa succede se manda un JPEG o un PNG. Non si riassume, non se ne cita un pezzo solo, non si riformula. Nessun'altra cifra sulla conversione e' valida: fuori da qui non ce ne sono.</w:t>
         <w:br/>
         <w:br/>
         <w:t>Frase da riportare parola per parola:</w:t>
-        <w:br/>
-        <w:t>"Le immagini vanno inviate in formato vettoriale (.AI, .EPS, .PDF, .SVG). Se hai solo un file raster (JPEG, PNG) lo accettiamo lo stesso: la conversione la facciamo noi e il costo e' di 25 euro a immagine. Se l'immagine e' semplice e lineare il nostro software riesce spesso a elaborarla senza costi aggiuntivi, e se le immagini sono piu' di una valutiamo un forfait in base al progetto: in entrambi i casi te lo confermiamo noi dopo aver visto i file, prima di procedere."</w:t>
         <w:br/>
         <w:br/>
         <w:t>Chi decide (informazione interna: rispondi solo allo staff): se un'immagine sia semplice e lineare, e se applicare un forfait quando le immagini sono piu' d'una, lo stabilisce chi gestisce l'ordine dopo aver visto i file. Non lo decide il bot e non lo anticipa: la frase dice che lo confermiamo dopo aver visto i file, e si ferma li'.</w:t>

</xml_diff>